<commit_message>
feat: update homepage content
</commit_message>
<xml_diff>
--- a/public/templates/Formato_Resumen_SIQUIUDEM.docx
+++ b/public/templates/Formato_Resumen_SIQUIUDEM.docx
@@ -654,41 +654,43 @@
         <w:t xml:space="preserve"> </w:t>
       </w:r>
       <w:r>
+        <w:rPr>
+          <w:lang w:val="es-MX"/>
+        </w:rPr>
         <w:t xml:space="preserve">Usar </w:t>
       </w:r>
       <w:r>
+        <w:rPr>
+          <w:lang w:val="es-MX"/>
+        </w:rPr>
         <w:t>“</w:t>
       </w:r>
       <w:r>
+        <w:rPr>
+          <w:lang w:val="es-MX"/>
+        </w:rPr>
         <w:t>Fig. 1</w:t>
       </w:r>
       <w:r>
+        <w:rPr>
+          <w:lang w:val="es-MX"/>
+        </w:rPr>
         <w:t>”</w:t>
       </w:r>
       <w:r>
-        <w:t xml:space="preserve"> </w:t>
-      </w:r>
-      <w:proofErr w:type="spellStart"/>
-      <w:r>
-        <w:t>en</w:t>
-      </w:r>
-      <w:proofErr w:type="spellEnd"/>
-      <w:r>
-        <w:t xml:space="preserve"> </w:t>
-      </w:r>
-      <w:proofErr w:type="spellStart"/>
-      <w:r>
-        <w:t>negrita</w:t>
-      </w:r>
-      <w:proofErr w:type="spellEnd"/>
-      <w:r>
-        <w:t>.</w:t>
-      </w:r>
-    </w:p>
-    <w:p>
-      <w:pPr>
-        <w:pStyle w:val="06MainText"/>
-        <w:ind w:firstLine="0"/>
+        <w:rPr>
+          <w:lang w:val="es-MX"/>
+        </w:rPr>
+        <w:t xml:space="preserve"> en negrita.</w:t>
+      </w:r>
+    </w:p>
+    <w:p>
+      <w:pPr>
+        <w:pStyle w:val="06MainText"/>
+        <w:ind w:firstLine="0"/>
+        <w:rPr>
+          <w:lang w:val="es-MX"/>
+        </w:rPr>
       </w:pPr>
     </w:p>
     <w:p>
@@ -696,16 +698,20 @@
         <w:pStyle w:val="06MainText"/>
         <w:ind w:firstLine="0"/>
         <w:jc w:val="center"/>
+        <w:rPr>
+          <w:lang w:val="es-MX"/>
+        </w:rPr>
       </w:pPr>
       <w:r>
         <w:rPr>
           <w:noProof/>
+          <w:lang w:val="es-MX"/>
         </w:rPr>
         <w:drawing>
-          <wp:inline distT="0" distB="0" distL="0" distR="0" wp14:anchorId="27B9F00A" wp14:editId="390479BD">
-            <wp:extent cx="1785257" cy="951213"/>
-            <wp:effectExtent l="0" t="0" r="5715" b="1905"/>
-            <wp:docPr id="931757878" name="Imagen 1" descr="Diagrama&#10;&#10;El contenido generado por IA puede ser incorrecto."/>
+          <wp:inline distT="0" distB="0" distL="0" distR="0" wp14:anchorId="2815A293" wp14:editId="0B4B1A53">
+            <wp:extent cx="2881312" cy="1537242"/>
+            <wp:effectExtent l="0" t="0" r="0" b="0"/>
+            <wp:docPr id="913578365" name="Imagen 1"/>
             <wp:cNvGraphicFramePr>
               <a:graphicFrameLocks xmlns:a="http://schemas.openxmlformats.org/drawingml/2006/main" noChangeAspect="1"/>
             </wp:cNvGraphicFramePr>
@@ -713,7 +719,7 @@
               <a:graphicData uri="http://schemas.openxmlformats.org/drawingml/2006/picture">
                 <pic:pic xmlns:pic="http://schemas.openxmlformats.org/drawingml/2006/picture">
                   <pic:nvPicPr>
-                    <pic:cNvPr id="931757878" name="Imagen 1" descr="Diagrama&#10;&#10;El contenido generado por IA puede ser incorrecto."/>
+                    <pic:cNvPr id="913578365" name="Imagen 913578365"/>
                     <pic:cNvPicPr/>
                   </pic:nvPicPr>
                   <pic:blipFill>
@@ -731,7 +737,7 @@
                   <pic:spPr>
                     <a:xfrm>
                       <a:off x="0" y="0"/>
-                      <a:ext cx="1837594" cy="979099"/>
+                      <a:ext cx="2905781" cy="1550297"/>
                     </a:xfrm>
                     <a:prstGeom prst="rect">
                       <a:avLst/>

</xml_diff>

<commit_message>
feat: update homepage content (#1)
</commit_message>
<xml_diff>
--- a/public/templates/Formato_Resumen_SIQUIUDEM.docx
+++ b/public/templates/Formato_Resumen_SIQUIUDEM.docx
@@ -654,41 +654,43 @@
         <w:t xml:space="preserve"> </w:t>
       </w:r>
       <w:r>
+        <w:rPr>
+          <w:lang w:val="es-MX"/>
+        </w:rPr>
         <w:t xml:space="preserve">Usar </w:t>
       </w:r>
       <w:r>
+        <w:rPr>
+          <w:lang w:val="es-MX"/>
+        </w:rPr>
         <w:t>“</w:t>
       </w:r>
       <w:r>
+        <w:rPr>
+          <w:lang w:val="es-MX"/>
+        </w:rPr>
         <w:t>Fig. 1</w:t>
       </w:r>
       <w:r>
+        <w:rPr>
+          <w:lang w:val="es-MX"/>
+        </w:rPr>
         <w:t>”</w:t>
       </w:r>
       <w:r>
-        <w:t xml:space="preserve"> </w:t>
-      </w:r>
-      <w:proofErr w:type="spellStart"/>
-      <w:r>
-        <w:t>en</w:t>
-      </w:r>
-      <w:proofErr w:type="spellEnd"/>
-      <w:r>
-        <w:t xml:space="preserve"> </w:t>
-      </w:r>
-      <w:proofErr w:type="spellStart"/>
-      <w:r>
-        <w:t>negrita</w:t>
-      </w:r>
-      <w:proofErr w:type="spellEnd"/>
-      <w:r>
-        <w:t>.</w:t>
-      </w:r>
-    </w:p>
-    <w:p>
-      <w:pPr>
-        <w:pStyle w:val="06MainText"/>
-        <w:ind w:firstLine="0"/>
+        <w:rPr>
+          <w:lang w:val="es-MX"/>
+        </w:rPr>
+        <w:t xml:space="preserve"> en negrita.</w:t>
+      </w:r>
+    </w:p>
+    <w:p>
+      <w:pPr>
+        <w:pStyle w:val="06MainText"/>
+        <w:ind w:firstLine="0"/>
+        <w:rPr>
+          <w:lang w:val="es-MX"/>
+        </w:rPr>
       </w:pPr>
     </w:p>
     <w:p>
@@ -696,16 +698,20 @@
         <w:pStyle w:val="06MainText"/>
         <w:ind w:firstLine="0"/>
         <w:jc w:val="center"/>
+        <w:rPr>
+          <w:lang w:val="es-MX"/>
+        </w:rPr>
       </w:pPr>
       <w:r>
         <w:rPr>
           <w:noProof/>
+          <w:lang w:val="es-MX"/>
         </w:rPr>
         <w:drawing>
-          <wp:inline distT="0" distB="0" distL="0" distR="0" wp14:anchorId="27B9F00A" wp14:editId="390479BD">
-            <wp:extent cx="1785257" cy="951213"/>
-            <wp:effectExtent l="0" t="0" r="5715" b="1905"/>
-            <wp:docPr id="931757878" name="Imagen 1" descr="Diagrama&#10;&#10;El contenido generado por IA puede ser incorrecto."/>
+          <wp:inline distT="0" distB="0" distL="0" distR="0" wp14:anchorId="2815A293" wp14:editId="0B4B1A53">
+            <wp:extent cx="2881312" cy="1537242"/>
+            <wp:effectExtent l="0" t="0" r="0" b="0"/>
+            <wp:docPr id="913578365" name="Imagen 1"/>
             <wp:cNvGraphicFramePr>
               <a:graphicFrameLocks xmlns:a="http://schemas.openxmlformats.org/drawingml/2006/main" noChangeAspect="1"/>
             </wp:cNvGraphicFramePr>
@@ -713,7 +719,7 @@
               <a:graphicData uri="http://schemas.openxmlformats.org/drawingml/2006/picture">
                 <pic:pic xmlns:pic="http://schemas.openxmlformats.org/drawingml/2006/picture">
                   <pic:nvPicPr>
-                    <pic:cNvPr id="931757878" name="Imagen 1" descr="Diagrama&#10;&#10;El contenido generado por IA puede ser incorrecto."/>
+                    <pic:cNvPr id="913578365" name="Imagen 913578365"/>
                     <pic:cNvPicPr/>
                   </pic:nvPicPr>
                   <pic:blipFill>
@@ -731,7 +737,7 @@
                   <pic:spPr>
                     <a:xfrm>
                       <a:off x="0" y="0"/>
-                      <a:ext cx="1837594" cy="979099"/>
+                      <a:ext cx="2905781" cy="1550297"/>
                     </a:xfrm>
                     <a:prstGeom prst="rect">
                       <a:avLst/>

</xml_diff>